<commit_message>
feat(deploy): VPS 部署套件 + CI + 旧站内容迁移
- deploy/vps：install.sh 一键安装、systemd 单元、Nginx 站点（cxh327.dpdns.org）、
  升级脚本（健康检查失败自动回滚）、环境变量模板、完整 runbook
- .github/workflows/ci.yml：测试 + 打包 + 在 CI 中构建镜像验证 Dockerfile + tag 推 GHCR
- content/legacy：旧站 7 篇「ZCFE」系列提取为 Markdown（序章 + 五章 + 好站推荐）
- scripts/import-posts.sh：调用后台接口批量导入，按标题判重可重复执行
- 修复 5 个脚本中变量名紧跟中文字符导致 bash 解析错误的问题（共 11 处）
- 说明书新增 6.6 旧站内容迁移
</commit_message>
<xml_diff>
--- a/docs/cxh个人博客系统-软件说明书.docx
+++ b/docs/cxh个人博客系统-软件说明书.docx
@@ -258,7 +258,7 @@
                 <w:rFonts w:ascii="Times New Roman" w:hAnsi="Times New Roman" w:eastAsia="宋体"/>
                 <w:sz w:val="18"/>
               </w:rPr>
-              <w:t>2026-10-15</w:t>
+              <w:t>2026-10-20</w:t>
             </w:r>
           </w:p>
         </w:tc>
@@ -9823,6 +9823,216 @@
                 <w:sz w:val="18"/>
               </w:rPr>
               <w:t>tar xzf uploads.tar.gz -C &lt;项目目录&gt;</w:t>
+            </w:r>
+          </w:p>
+        </w:tc>
+      </w:tr>
+    </w:tbl>
+    <w:p/>
+    <w:p>
+      <w:pPr>
+        <w:pStyle w:val="Heading2"/>
+      </w:pPr>
+      <w:r>
+        <w:t>6.6 旧站内容迁移</w:t>
+      </w:r>
+    </w:p>
+    <w:p>
+      <w:r>
+        <w:t>从旧静态站切换到本系统时，历史文章可以批量导入。本项目把旧站内容提取成了带 front matter 的 Markdown（content/legacy/），并用脚本调用后台接口逐篇发布，既不依赖后台手工逐条粘贴，也不引入额外的导入格式。</w:t>
+      </w:r>
+    </w:p>
+    <w:p>
+      <w:pPr>
+        <w:spacing w:after="160"/>
+        <w:ind w:left="340"/>
+      </w:pPr>
+      <w:r>
+        <w:rPr>
+          <w:rFonts w:ascii="Consolas" w:hAnsi="Consolas" w:eastAsia="Consolas"/>
+          <w:sz w:val="18"/>
+        </w:rPr>
+        <w:t># 在服务器上（应用已启动）</w:t>
+        <w:br/>
+        <w:t>cd /opt/cxh-blog</w:t>
+        <w:br/>
+        <w:t>PASS='后台口令' scripts/import-posts.sh</w:t>
+        <w:br/>
+        <w:br/>
+        <w:t># 也可指定地址与目录</w:t>
+        <w:br/>
+        <w:t>BASE=http://127.0.0.1:8080 USER=admin PASS=xxx DIR=content/legacy scripts/import-posts.sh</w:t>
+      </w:r>
+    </w:p>
+    <w:tbl>
+      <w:tblPr>
+        <w:tblStyle w:val="TableGrid"/>
+        <w:tblW w:type="auto" w:w="0"/>
+        <w:jc w:val="center"/>
+        <w:tblLook w:firstColumn="1" w:firstRow="1" w:lastColumn="0" w:lastRow="0" w:noHBand="0" w:noVBand="1" w:val="04A0"/>
+      </w:tblPr>
+      <w:tblGrid>
+        <w:gridCol w:w="4646"/>
+        <w:gridCol w:w="4646"/>
+      </w:tblGrid>
+      <w:tr>
+        <w:tc>
+          <w:tcPr>
+            <w:tcW w:type="dxa" w:w="1474"/>
+          </w:tcPr>
+          <w:p>
+            <w:r/>
+            <w:r>
+              <w:rPr>
+                <w:rFonts w:ascii="Arial" w:hAnsi="Arial" w:eastAsia="黑体"/>
+                <w:b/>
+                <w:sz w:val="19"/>
+              </w:rPr>
+              <w:t>要点</w:t>
+            </w:r>
+          </w:p>
+        </w:tc>
+        <w:tc>
+          <w:tcPr>
+            <w:tcW w:type="dxa" w:w="7030"/>
+          </w:tcPr>
+          <w:p>
+            <w:r/>
+            <w:r>
+              <w:rPr>
+                <w:rFonts w:ascii="Arial" w:hAnsi="Arial" w:eastAsia="黑体"/>
+                <w:b/>
+                <w:sz w:val="19"/>
+              </w:rPr>
+              <w:t>说明</w:t>
+            </w:r>
+          </w:p>
+        </w:tc>
+      </w:tr>
+      <w:tr>
+        <w:tc>
+          <w:tcPr>
+            <w:tcW w:type="dxa" w:w="1474"/>
+          </w:tcPr>
+          <w:p>
+            <w:r/>
+            <w:r>
+              <w:rPr>
+                <w:rFonts w:ascii="Times New Roman" w:hAnsi="Times New Roman" w:eastAsia="宋体"/>
+                <w:sz w:val="18"/>
+              </w:rPr>
+              <w:t>文件格式</w:t>
+            </w:r>
+          </w:p>
+        </w:tc>
+        <w:tc>
+          <w:tcPr>
+            <w:tcW w:type="dxa" w:w="7030"/>
+          </w:tcPr>
+          <w:p>
+            <w:r/>
+            <w:r>
+              <w:rPr>
+                <w:rFonts w:ascii="Times New Roman" w:hAnsi="Times New Roman" w:eastAsia="宋体"/>
+                <w:sz w:val="18"/>
+              </w:rPr>
+              <w:t>--- 包裹的 title / tags / summary + 正文 Markdown</w:t>
+            </w:r>
+          </w:p>
+        </w:tc>
+      </w:tr>
+      <w:tr>
+        <w:tc>
+          <w:tcPr>
+            <w:tcW w:type="dxa" w:w="1474"/>
+          </w:tcPr>
+          <w:p>
+            <w:r/>
+            <w:r>
+              <w:rPr>
+                <w:rFonts w:ascii="Times New Roman" w:hAnsi="Times New Roman" w:eastAsia="宋体"/>
+                <w:sz w:val="18"/>
+              </w:rPr>
+              <w:t>重复执行</w:t>
+            </w:r>
+          </w:p>
+        </w:tc>
+        <w:tc>
+          <w:tcPr>
+            <w:tcW w:type="dxa" w:w="7030"/>
+          </w:tcPr>
+          <w:p>
+            <w:r/>
+            <w:r>
+              <w:rPr>
+                <w:rFonts w:ascii="Times New Roman" w:hAnsi="Times New Roman" w:eastAsia="宋体"/>
+                <w:sz w:val="18"/>
+              </w:rPr>
+              <w:t>按标题判重，已存在的文章自动跳过</w:t>
+            </w:r>
+          </w:p>
+        </w:tc>
+      </w:tr>
+      <w:tr>
+        <w:tc>
+          <w:tcPr>
+            <w:tcW w:type="dxa" w:w="1474"/>
+          </w:tcPr>
+          <w:p>
+            <w:r/>
+            <w:r>
+              <w:rPr>
+                <w:rFonts w:ascii="Times New Roman" w:hAnsi="Times New Roman" w:eastAsia="宋体"/>
+                <w:sz w:val="18"/>
+              </w:rPr>
+              <w:t>图片</w:t>
+            </w:r>
+          </w:p>
+        </w:tc>
+        <w:tc>
+          <w:tcPr>
+            <w:tcW w:type="dxa" w:w="7030"/>
+          </w:tcPr>
+          <w:p>
+            <w:r/>
+            <w:r>
+              <w:rPr>
+                <w:rFonts w:ascii="Times New Roman" w:hAnsi="Times New Roman" w:eastAsia="宋体"/>
+                <w:sz w:val="18"/>
+              </w:rPr>
+              <w:t>引用工程内已有的 /images/gallery/ 资源，无需重复上传</w:t>
+            </w:r>
+          </w:p>
+        </w:tc>
+      </w:tr>
+      <w:tr>
+        <w:tc>
+          <w:tcPr>
+            <w:tcW w:type="dxa" w:w="1474"/>
+          </w:tcPr>
+          <w:p>
+            <w:r/>
+            <w:r>
+              <w:rPr>
+                <w:rFonts w:ascii="Times New Roman" w:hAnsi="Times New Roman" w:eastAsia="宋体"/>
+                <w:sz w:val="18"/>
+              </w:rPr>
+              <w:t>失败可见</w:t>
+            </w:r>
+          </w:p>
+        </w:tc>
+        <w:tc>
+          <w:tcPr>
+            <w:tcW w:type="dxa" w:w="7030"/>
+          </w:tcPr>
+          <w:p>
+            <w:r/>
+            <w:r>
+              <w:rPr>
+                <w:rFonts w:ascii="Times New Roman" w:hAnsi="Times New Roman" w:eastAsia="宋体"/>
+                <w:sz w:val="18"/>
+              </w:rPr>
+              <w:t>每篇打印结果，任一失败返回非 0 退出码</w:t>
             </w:r>
           </w:p>
         </w:tc>

</xml_diff>